<commit_message>
Publish learning notes and generated artifacts
</commit_message>
<xml_diff>
--- a/profile/jiawei-resume.docx
+++ b/profile/jiawei-resume.docx
@@ -24,7 +24,7 @@
         </w:tabs>
         <w:spacing w:before="175"/>
         <w:rPr>
-          <w:rFonts w:ascii="Lucida Sans Unicode" w:hint="eastAsia"/>
+          <w:rFonts w:ascii="Lucida Sans Unicode"/>
           <w:sz w:val="18"/>
           <w:lang w:eastAsia="zh-CN"/>
         </w:rPr>
@@ -111,16 +111,7 @@
           <w:sz w:val="18"/>
           <w:lang w:eastAsia="zh-CN"/>
         </w:rPr>
-        <w:t xml:space="preserve">                           Location: </w:t>
-      </w:r>
-      <w:r>
-        <w:rPr>
-          <w:rFonts w:ascii="Lucida Sans Unicode" w:hint="eastAsia"/>
-          <w:color w:val="002123"/>
-          <w:sz w:val="18"/>
-          <w:lang w:eastAsia="zh-CN"/>
-        </w:rPr>
-        <w:t>Beijing</w:t>
+        <w:t xml:space="preserve">                           Location: Beijing</w:t>
       </w:r>
       <w:r>
         <w:rPr>
@@ -192,63 +183,213 @@
     <w:p>
       <w:pPr>
         <w:pStyle w:val="Body"/>
+        <w:rPr>
+          <w:lang w:eastAsia="zh-CN"/>
+        </w:rPr>
       </w:pPr>
       <w:proofErr w:type="spellStart"/>
       <w:r>
-        <w:t>作为 AI Browser 核心智能体验的端到端 owner，同时负责 Agent 效果迭代、深度场景定义、核心 case 设计与下一代产品智能能力演进——向下负责 Agent Harness 自迭代系统（auto-evaluation → auto-analysis → auto-iteration 全链路）、Agent runtime 架构、auto-skill pipeline 与 training flywheel，向上定义"Browser × Agent"的产品形态、能力边界与体验基线，覆盖 browser-use / computer-use 场景。主导 Tabbit 相关 benchmark、核心 case 与迭代闭环建设，支撑核心能力评分从约 50 提升至约 90。</w:t>
+        <w:t>作为</w:t>
       </w:r>
       <w:proofErr w:type="spellEnd"/>
-      <w:r/>
+      <w:r>
+        <w:t xml:space="preserve"> AI Browser </w:t>
+      </w:r>
       <w:proofErr w:type="spellStart"/>
-      <w:r/>
+      <w:r>
+        <w:t>核心智能体验的端到端</w:t>
+      </w:r>
       <w:proofErr w:type="spellEnd"/>
-      <w:r/>
+      <w:r>
+        <w:t xml:space="preserve"> </w:t>
+      </w:r>
       <w:proofErr w:type="spellStart"/>
-      <w:r/>
-      <w:r/>
+      <w:r>
+        <w:t>owner</w:t>
+      </w:r>
+      <w:r>
+        <w:t>，同时负责</w:t>
+      </w:r>
       <w:proofErr w:type="spellEnd"/>
-      <w:r/>
+      <w:r>
+        <w:t xml:space="preserve"> Agent </w:t>
+      </w:r>
       <w:proofErr w:type="spellStart"/>
-      <w:r/>
+      <w:r>
+        <w:t>效果迭代、深度场景定义、核心</w:t>
+      </w:r>
       <w:proofErr w:type="spellEnd"/>
-      <w:r/>
+      <w:r>
+        <w:t xml:space="preserve"> case </w:t>
+      </w:r>
       <w:proofErr w:type="spellStart"/>
-      <w:r/>
+      <w:r>
+        <w:t>设计与下一代产品智能能力演进</w:t>
+      </w:r>
       <w:proofErr w:type="spellEnd"/>
-      <w:r/>
+      <w:r>
+        <w:t>——</w:t>
+      </w:r>
       <w:proofErr w:type="spellStart"/>
-      <w:r/>
+      <w:r>
+        <w:t>向下负责</w:t>
+      </w:r>
       <w:proofErr w:type="spellEnd"/>
-      <w:r/>
+      <w:r>
+        <w:t xml:space="preserve"> Agent Harness </w:t>
+      </w:r>
       <w:proofErr w:type="spellStart"/>
-      <w:r/>
-      <w:r/>
+      <w:r>
+        <w:t>自迭代系统（</w:t>
+      </w:r>
+      <w:r>
+        <w:t>auto-evaluation</w:t>
+      </w:r>
       <w:proofErr w:type="spellEnd"/>
-      <w:r/>
+      <w:r>
+        <w:t xml:space="preserve"> → auto-analysis → auto-iteration </w:t>
+      </w:r>
       <w:proofErr w:type="spellStart"/>
-      <w:r/>
+      <w:r>
+        <w:t>全链路</w:t>
+      </w:r>
       <w:proofErr w:type="spellEnd"/>
-      <w:r/>
-      <w:r/>
+      <w:r>
+        <w:t>）、</w:t>
+      </w:r>
+      <w:r>
+        <w:t xml:space="preserve">Agent runtime </w:t>
+      </w:r>
       <w:proofErr w:type="spellStart"/>
-      <w:r/>
+      <w:r>
+        <w:t>架构、</w:t>
+      </w:r>
+      <w:r>
+        <w:t>auto-skill</w:t>
+      </w:r>
       <w:proofErr w:type="spellEnd"/>
-      <w:r/>
+      <w:r>
+        <w:t xml:space="preserve"> pipeline </w:t>
+      </w:r>
+      <w:r>
+        <w:t>与</w:t>
+      </w:r>
+      <w:r>
+        <w:t xml:space="preserve"> training </w:t>
+      </w:r>
       <w:proofErr w:type="spellStart"/>
-      <w:r/>
-      <w:r/>
-      <w:r/>
+      <w:r>
+        <w:t>flywheel</w:t>
+      </w:r>
+      <w:r>
+        <w:t>，向上定义</w:t>
+      </w:r>
+      <w:r>
+        <w:t>"Browser</w:t>
+      </w:r>
       <w:proofErr w:type="spellEnd"/>
-      <w:r/>
+      <w:r>
+        <w:t xml:space="preserve"> × </w:t>
+      </w:r>
       <w:proofErr w:type="spellStart"/>
-      <w:r/>
-      <w:r/>
+      <w:r>
+        <w:t>Agent"</w:t>
+      </w:r>
+      <w:r>
+        <w:t>的产品形态、能力边界与体验基线，覆盖</w:t>
+      </w:r>
       <w:proofErr w:type="spellEnd"/>
-      <w:r/>
+      <w:r>
+        <w:t xml:space="preserve"> browser-use / computer-use </w:t>
+      </w:r>
       <w:proofErr w:type="spellStart"/>
-      <w:r/>
+      <w:r>
+        <w:t>场景</w:t>
+      </w:r>
       <w:proofErr w:type="spellEnd"/>
-      <w:r/>
+      <w:r>
+        <w:t>。</w:t>
+      </w:r>
+      <w:r>
+        <w:rPr>
+          <w:lang w:eastAsia="zh-CN"/>
+        </w:rPr>
+        <w:t>主导</w:t>
+      </w:r>
+      <w:r>
+        <w:rPr>
+          <w:lang w:eastAsia="zh-CN"/>
+        </w:rPr>
+        <w:t xml:space="preserve"> </w:t>
+      </w:r>
+      <w:proofErr w:type="spellStart"/>
+      <w:r>
+        <w:rPr>
+          <w:lang w:eastAsia="zh-CN"/>
+        </w:rPr>
+        <w:t>Tabbit</w:t>
+      </w:r>
+      <w:proofErr w:type="spellEnd"/>
+      <w:r>
+        <w:rPr>
+          <w:lang w:eastAsia="zh-CN"/>
+        </w:rPr>
+        <w:t xml:space="preserve"> </w:t>
+      </w:r>
+      <w:r>
+        <w:rPr>
+          <w:lang w:eastAsia="zh-CN"/>
+        </w:rPr>
+        <w:t>相关</w:t>
+      </w:r>
+      <w:r>
+        <w:rPr>
+          <w:lang w:eastAsia="zh-CN"/>
+        </w:rPr>
+        <w:t xml:space="preserve"> benchmark</w:t>
+      </w:r>
+      <w:r>
+        <w:rPr>
+          <w:lang w:eastAsia="zh-CN"/>
+        </w:rPr>
+        <w:t>、核心</w:t>
+      </w:r>
+      <w:r>
+        <w:rPr>
+          <w:lang w:eastAsia="zh-CN"/>
+        </w:rPr>
+        <w:t xml:space="preserve"> case </w:t>
+      </w:r>
+      <w:r>
+        <w:rPr>
+          <w:lang w:eastAsia="zh-CN"/>
+        </w:rPr>
+        <w:t>与迭代闭环建设，支撑核心能力评分从约</w:t>
+      </w:r>
+      <w:r>
+        <w:rPr>
+          <w:lang w:eastAsia="zh-CN"/>
+        </w:rPr>
+        <w:t xml:space="preserve"> 50 </w:t>
+      </w:r>
+      <w:r>
+        <w:rPr>
+          <w:lang w:eastAsia="zh-CN"/>
+        </w:rPr>
+        <w:t>提升至约</w:t>
+      </w:r>
+      <w:r>
+        <w:rPr>
+          <w:lang w:eastAsia="zh-CN"/>
+        </w:rPr>
+        <w:t xml:space="preserve"> 90</w:t>
+      </w:r>
+      <w:r>
+        <w:rPr>
+          <w:lang w:eastAsia="zh-CN"/>
+        </w:rPr>
+        <w:t>。</w:t>
+      </w:r>
     </w:p>
     <w:p>
       <w:pPr>
@@ -275,135 +416,146 @@
       </w:r>
       <w:proofErr w:type="spellStart"/>
       <w:r>
-        <w:t>以控制论视角设计</w:t>
+        <w:t>以训练范式重构效果迭代：将</w:t>
       </w:r>
       <w:proofErr w:type="spellEnd"/>
       <w:r>
+        <w:t xml:space="preserve"> benchmark </w:t>
+      </w:r>
+      <w:r>
+        <w:rPr>
+          <w:rFonts w:hint="eastAsia"/>
+          <w:lang w:eastAsia="zh-CN"/>
+        </w:rPr>
+        <w:t xml:space="preserve">&amp; evaluation </w:t>
+      </w:r>
+      <w:r>
+        <w:t xml:space="preserve">score </w:t>
+      </w:r>
+      <w:proofErr w:type="spellStart"/>
+      <w:r>
+        <w:t>视为</w:t>
+      </w:r>
+      <w:proofErr w:type="spellEnd"/>
+      <w:r>
+        <w:t xml:space="preserve"> </w:t>
+      </w:r>
+      <w:proofErr w:type="spellStart"/>
+      <w:r>
+        <w:t>objective</w:t>
+      </w:r>
+      <w:r>
+        <w:t>，</w:t>
+      </w:r>
+      <w:r>
+        <w:t>auto-analysis</w:t>
+      </w:r>
+      <w:proofErr w:type="spellEnd"/>
+      <w:r>
+        <w:t xml:space="preserve"> </w:t>
+      </w:r>
+      <w:proofErr w:type="spellStart"/>
+      <w:r>
+        <w:t>产出的结构化归因当作</w:t>
+      </w:r>
+      <w:proofErr w:type="spellEnd"/>
+      <w:r>
+        <w:t xml:space="preserve"> loss</w:t>
+      </w:r>
+      <w:r>
+        <w:rPr>
+          <w:rFonts w:hint="eastAsia"/>
+          <w:lang w:eastAsia="zh-CN"/>
+        </w:rPr>
+        <w:t>，</w:t>
+      </w:r>
+      <w:proofErr w:type="spellStart"/>
+      <w:r>
+        <w:t>context</w:t>
+      </w:r>
+      <w:r>
+        <w:t>、</w:t>
+      </w:r>
+      <w:r>
+        <w:t>memory</w:t>
+      </w:r>
+      <w:r>
+        <w:t>、</w:t>
+      </w:r>
+      <w:r>
+        <w:t>Agent</w:t>
+      </w:r>
+      <w:proofErr w:type="spellEnd"/>
+      <w:r>
+        <w:t xml:space="preserve"> Skill </w:t>
+      </w:r>
+      <w:r>
+        <w:t>与</w:t>
+      </w:r>
+      <w:r>
+        <w:t xml:space="preserve"> system prompt </w:t>
+      </w:r>
+      <w:r>
+        <w:t>视作可更新的</w:t>
+      </w:r>
+      <w:r>
+        <w:t>"</w:t>
+      </w:r>
+      <w:proofErr w:type="spellStart"/>
+      <w:r>
+        <w:t>参数空间</w:t>
+      </w:r>
+      <w:proofErr w:type="spellEnd"/>
+      <w:r>
+        <w:t>"</w:t>
+      </w:r>
+      <w:r>
+        <w:t>，</w:t>
+      </w:r>
+      <w:proofErr w:type="spellStart"/>
+      <w:r>
+        <w:t>由高阶</w:t>
+      </w:r>
+      <w:proofErr w:type="spellEnd"/>
+      <w:r>
         <w:t xml:space="preserve"> Agent </w:t>
       </w:r>
       <w:proofErr w:type="spellStart"/>
       <w:r>
-        <w:t>Loop</w:t>
-      </w:r>
-      <w:r>
-        <w:t>：把</w:t>
+        <w:t>控制层在其上施加</w:t>
       </w:r>
       <w:proofErr w:type="spellEnd"/>
       <w:r>
-        <w:t xml:space="preserve"> LLM policy </w:t>
+        <w:t xml:space="preserve"> gradient-like </w:t>
       </w:r>
       <w:proofErr w:type="spellStart"/>
       <w:r>
-        <w:t>当作</w:t>
+        <w:t>的迭代更新，使每次</w:t>
       </w:r>
       <w:proofErr w:type="spellEnd"/>
       <w:r>
-        <w:t xml:space="preserve"> </w:t>
+        <w:t xml:space="preserve"> benchmark </w:t>
+      </w:r>
+      <w:r>
+        <w:t>回归都等价于一次可解释的</w:t>
+      </w:r>
+      <w:r>
+        <w:t>"</w:t>
       </w:r>
       <w:proofErr w:type="spellStart"/>
       <w:r>
-        <w:t>plant</w:t>
-      </w:r>
-      <w:r>
-        <w:t>，把</w:t>
+        <w:t>参数步进</w:t>
       </w:r>
       <w:proofErr w:type="spellEnd"/>
       <w:r>
-        <w:t xml:space="preserve"> harness </w:t>
+        <w:t>"</w:t>
+      </w:r>
+      <w:r>
+        <w:t>，</w:t>
       </w:r>
       <w:proofErr w:type="spellStart"/>
       <w:r>
-        <w:t>当作</w:t>
-      </w:r>
-      <w:proofErr w:type="spellEnd"/>
-      <w:r>
-        <w:t xml:space="preserve"> </w:t>
-      </w:r>
-      <w:proofErr w:type="spellStart"/>
-      <w:r>
-        <w:t>controller</w:t>
-      </w:r>
-      <w:r>
-        <w:t>，把</w:t>
-      </w:r>
-      <w:proofErr w:type="spellEnd"/>
-      <w:r>
-        <w:t xml:space="preserve"> evaluation / semantic observer </w:t>
-      </w:r>
-      <w:proofErr w:type="spellStart"/>
-      <w:r>
-        <w:t>当作</w:t>
-      </w:r>
-      <w:proofErr w:type="spellEnd"/>
-      <w:r>
-        <w:t xml:space="preserve"> feedback </w:t>
-      </w:r>
-      <w:proofErr w:type="spellStart"/>
-      <w:r>
-        <w:t>sensor</w:t>
-      </w:r>
-      <w:r>
-        <w:t>，通过显式拆分</w:t>
-      </w:r>
-      <w:proofErr w:type="spellEnd"/>
-      <w:r>
-        <w:t xml:space="preserve"> </w:t>
-      </w:r>
-      <w:proofErr w:type="spellStart"/>
-      <w:r>
-        <w:t>setpoint</w:t>
-      </w:r>
-      <w:r>
-        <w:t>（任务目标</w:t>
-      </w:r>
-      <w:proofErr w:type="spellEnd"/>
-      <w:r>
-        <w:t>）、</w:t>
-      </w:r>
-      <w:proofErr w:type="spellStart"/>
-      <w:r>
-        <w:t>state</w:t>
-      </w:r>
-      <w:r>
-        <w:t>（执行上下文</w:t>
-      </w:r>
-      <w:proofErr w:type="spellEnd"/>
-      <w:r>
-        <w:t>）、</w:t>
-      </w:r>
-      <w:proofErr w:type="spellStart"/>
-      <w:r>
-        <w:t>observation</w:t>
-      </w:r>
-      <w:r>
-        <w:t>（环境反馈）与</w:t>
-      </w:r>
-      <w:proofErr w:type="spellEnd"/>
-      <w:r>
-        <w:t xml:space="preserve"> </w:t>
-      </w:r>
-      <w:proofErr w:type="spellStart"/>
-      <w:r>
-        <w:t>actuation</w:t>
-      </w:r>
-      <w:r>
-        <w:t>（工具调用</w:t>
-      </w:r>
-      <w:proofErr w:type="spellEnd"/>
-      <w:r>
-        <w:t>），</w:t>
-      </w:r>
-      <w:proofErr w:type="spellStart"/>
-      <w:r>
-        <w:t>抑制长路径任务中的振荡与发散，换取系统级稳定性而非单点</w:t>
-      </w:r>
-      <w:proofErr w:type="spellEnd"/>
-      <w:r>
-        <w:t xml:space="preserve"> prompt </w:t>
-      </w:r>
-      <w:proofErr w:type="spellStart"/>
-      <w:r>
-        <w:t>调优</w:t>
+        <w:t>而非一次性人工调参</w:t>
       </w:r>
       <w:proofErr w:type="spellEnd"/>
       <w:r>
@@ -412,172 +564,99 @@
     </w:p>
     <w:p>
       <w:pPr>
-        <w:pStyle w:val="Bul"/>
-      </w:pPr>
-      <w:r>
-        <w:t xml:space="preserve">• </w:t>
+        <w:pStyle w:val="Sub"/>
+      </w:pPr>
+      <w:r>
+        <w:t xml:space="preserve">Agent Harness Self-Iteration </w:t>
       </w:r>
       <w:proofErr w:type="spellStart"/>
       <w:r>
-        <w:t>以训练范式重构效果迭代：将</w:t>
+        <w:t>Pipeline</w:t>
+      </w:r>
+      <w:r>
+        <w:t>（核心方向</w:t>
       </w:r>
       <w:proofErr w:type="spellEnd"/>
       <w:r>
-        <w:t xml:space="preserve"> benchmark score </w:t>
-      </w:r>
-      <w:proofErr w:type="spellStart"/>
-      <w:r>
-        <w:t>视为</w:t>
-      </w:r>
-      <w:proofErr w:type="spellEnd"/>
-      <w:r>
-        <w:t xml:space="preserve"> </w:t>
-      </w:r>
-      <w:proofErr w:type="spellStart"/>
-      <w:r>
-        <w:t>objective</w:t>
-      </w:r>
-      <w:r>
-        <w:t>，</w:t>
-      </w:r>
-      <w:r>
-        <w:t>auto-analysis</w:t>
-      </w:r>
-      <w:proofErr w:type="spellEnd"/>
-      <w:r>
-        <w:t xml:space="preserve"> </w:t>
-      </w:r>
-      <w:proofErr w:type="spellStart"/>
-      <w:r>
-        <w:t>产出的结构化归因当作</w:t>
-      </w:r>
-      <w:proofErr w:type="spellEnd"/>
-      <w:r>
-        <w:t xml:space="preserve"> </w:t>
-      </w:r>
-      <w:proofErr w:type="spellStart"/>
-      <w:r>
-        <w:t>loss</w:t>
-      </w:r>
-      <w:r>
-        <w:t>，把</w:t>
-      </w:r>
-      <w:proofErr w:type="spellEnd"/>
-      <w:r>
-        <w:t xml:space="preserve"> context </w:t>
-      </w:r>
-      <w:proofErr w:type="spellStart"/>
-      <w:r>
-        <w:t>结构、</w:t>
-      </w:r>
-      <w:r>
-        <w:t>memory</w:t>
-      </w:r>
-      <w:proofErr w:type="spellEnd"/>
-      <w:r>
-        <w:t xml:space="preserve"> </w:t>
-      </w:r>
-      <w:proofErr w:type="spellStart"/>
-      <w:r>
-        <w:t>组织、</w:t>
-      </w:r>
-      <w:r>
-        <w:t>Agent</w:t>
-      </w:r>
-      <w:proofErr w:type="spellEnd"/>
-      <w:r>
-        <w:t xml:space="preserve"> Skill </w:t>
-      </w:r>
-      <w:r>
-        <w:t>与</w:t>
-      </w:r>
-      <w:r>
-        <w:t xml:space="preserve"> system prompt </w:t>
-      </w:r>
-      <w:r>
-        <w:t>视作可更新的</w:t>
-      </w:r>
-      <w:r>
-        <w:t>"</w:t>
-      </w:r>
-      <w:proofErr w:type="spellStart"/>
-      <w:r>
-        <w:t>参数空间</w:t>
-      </w:r>
-      <w:proofErr w:type="spellEnd"/>
-      <w:r>
-        <w:t>"</w:t>
-      </w:r>
-      <w:r>
-        <w:t>，</w:t>
-      </w:r>
-      <w:proofErr w:type="spellStart"/>
-      <w:r>
-        <w:t>由高阶</w:t>
-      </w:r>
-      <w:proofErr w:type="spellEnd"/>
-      <w:r>
-        <w:t xml:space="preserve"> Agent </w:t>
-      </w:r>
-      <w:proofErr w:type="spellStart"/>
-      <w:r>
-        <w:t>控制层在其上施加</w:t>
-      </w:r>
-      <w:proofErr w:type="spellEnd"/>
-      <w:r>
-        <w:t xml:space="preserve"> gradient-like </w:t>
-      </w:r>
-      <w:proofErr w:type="spellStart"/>
-      <w:r>
-        <w:t>的迭代更新，使每次</w:t>
-      </w:r>
-      <w:proofErr w:type="spellEnd"/>
-      <w:r>
-        <w:t xml:space="preserve"> benchmark </w:t>
-      </w:r>
-      <w:r>
-        <w:t>回归都等价于一次可解释的</w:t>
-      </w:r>
-      <w:r>
-        <w:t>"</w:t>
-      </w:r>
-      <w:proofErr w:type="spellStart"/>
-      <w:r>
-        <w:t>参数步进</w:t>
-      </w:r>
-      <w:proofErr w:type="spellEnd"/>
-      <w:r>
-        <w:t>"</w:t>
-      </w:r>
-      <w:r>
-        <w:t>，</w:t>
-      </w:r>
-      <w:proofErr w:type="spellStart"/>
-      <w:r>
-        <w:t>而非一次性人工调参</w:t>
-      </w:r>
-      <w:proofErr w:type="spellEnd"/>
-      <w:r>
-        <w:t>。</w:t>
+        <w:t>）</w:t>
       </w:r>
     </w:p>
     <w:p>
       <w:pPr>
-        <w:pStyle w:val="Sub"/>
-      </w:pPr>
-      <w:r>
-        <w:t xml:space="preserve">Agent Harness Self-Iteration </w:t>
+        <w:pStyle w:val="Bul"/>
+      </w:pPr>
+      <w:r>
+        <w:t xml:space="preserve">• </w:t>
+      </w:r>
+      <w:r>
+        <w:t>设计并落地</w:t>
+      </w:r>
+      <w:r>
+        <w:t xml:space="preserve"> auto-evaluation → auto-analysis → auto-iteration </w:t>
+      </w:r>
+      <w:r>
+        <w:t>全链路闭环系统：以更高阶的</w:t>
+      </w:r>
+      <w:r>
+        <w:t xml:space="preserve"> Agent </w:t>
+      </w:r>
+      <w:r>
+        <w:t>控制层自动完成子</w:t>
+      </w:r>
+      <w:r>
+        <w:t xml:space="preserve"> Agent </w:t>
+      </w:r>
+      <w:r>
+        <w:t>的效果评测、失败归因与迭代决策，将</w:t>
+      </w:r>
+      <w:r>
+        <w:t>"</w:t>
+      </w:r>
+      <w:r>
+        <w:t>人驱动迭代</w:t>
+      </w:r>
+      <w:r>
+        <w:t>"</w:t>
+      </w:r>
+      <w:r>
+        <w:t>升级为</w:t>
+      </w:r>
+      <w:r>
+        <w:t>"</w:t>
+      </w:r>
+      <w:r>
+        <w:t>系统驱动迭代</w:t>
+      </w:r>
+      <w:r>
+        <w:t>"</w:t>
+      </w:r>
+      <w:r>
+        <w:t>，支撑</w:t>
+      </w:r>
+      <w:r>
+        <w:t xml:space="preserve"> Tabbit benchmark </w:t>
+      </w:r>
+      <w:r>
+        <w:t>从约</w:t>
+      </w:r>
+      <w:r>
+        <w:t xml:space="preserve"> 50 </w:t>
       </w:r>
       <w:proofErr w:type="spellStart"/>
       <w:r>
-        <w:t>Pipeline</w:t>
-      </w:r>
-      <w:r>
-        <w:t>（核心方向</w:t>
+        <w:t>分提升至约</w:t>
       </w:r>
       <w:proofErr w:type="spellEnd"/>
       <w:r>
-        <w:t>）</w:t>
+        <w:t xml:space="preserve"> 90 </w:t>
+      </w:r>
+      <w:proofErr w:type="spellStart"/>
+      <w:r>
+        <w:t>分，并大幅降低人工参与带宽</w:t>
+      </w:r>
+      <w:proofErr w:type="spellEnd"/>
+      <w:r>
+        <w:t>。</w:t>
       </w:r>
     </w:p>
     <w:p>
@@ -585,35 +664,87 @@
         <w:pStyle w:val="Bul"/>
       </w:pPr>
       <w:r>
-        <w:t>• 设计并落地 auto-evaluation → auto-analysis → auto-iteration 全链路闭环系统：以更高阶的 Agent 控制层自动完成子 Agent 的效果评测、失败归因与迭代决策，将"人驱动迭代"升级为"系统驱动迭代"，支撑 Tabbit benchmark 从约 50 分提升至约 90 分，并大幅降低人工参与带宽。</w:t>
+        <w:t xml:space="preserve">• </w:t>
       </w:r>
       <w:proofErr w:type="spellStart"/>
-      <w:r/>
+      <w:r>
+        <w:t>拆解</w:t>
+      </w:r>
       <w:proofErr w:type="spellEnd"/>
-      <w:r/>
+      <w:r>
+        <w:t xml:space="preserve"> Agent </w:t>
+      </w:r>
       <w:proofErr w:type="spellStart"/>
-      <w:r/>
+      <w:r>
+        <w:t>效果迭代的完整可调空间并实现自动化迭代覆盖：</w:t>
+      </w:r>
+      <w:r>
+        <w:t>context</w:t>
+      </w:r>
       <w:proofErr w:type="spellEnd"/>
-      <w:r/>
+      <w:r>
+        <w:t xml:space="preserve"> </w:t>
+      </w:r>
       <w:proofErr w:type="spellStart"/>
-      <w:r/>
+      <w:r>
+        <w:t>结构与去噪策略、</w:t>
+      </w:r>
+      <w:r>
+        <w:t>tool</w:t>
+      </w:r>
       <w:proofErr w:type="spellEnd"/>
-      <w:r/>
-      <w:r/>
-      <w:r/>
-      <w:r/>
-      <w:r/>
-      <w:r/>
-      <w:r/>
+      <w:r>
+        <w:t xml:space="preserve"> </w:t>
+      </w:r>
       <w:proofErr w:type="spellStart"/>
-      <w:r/>
+      <w:r>
+        <w:t>空间定义与组合、</w:t>
+      </w:r>
+      <w:r>
+        <w:t>system</w:t>
+      </w:r>
       <w:proofErr w:type="spellEnd"/>
-      <w:r/>
-      <w:r/>
+      <w:r>
+        <w:t xml:space="preserve"> prompt </w:t>
+      </w:r>
       <w:proofErr w:type="spellStart"/>
-      <w:r/>
+      <w:r>
+        <w:t>工程、</w:t>
+      </w:r>
+      <w:r>
+        <w:t>Agent</w:t>
+      </w:r>
       <w:proofErr w:type="spellEnd"/>
-      <w:r/>
+      <w:r>
+        <w:t xml:space="preserve"> Skill </w:t>
+      </w:r>
+      <w:proofErr w:type="spellStart"/>
+      <w:r>
+        <w:t>注入与编排、以及方案选型（</w:t>
+      </w:r>
+      <w:r>
+        <w:t>GUI</w:t>
+      </w:r>
+      <w:proofErr w:type="spellEnd"/>
+      <w:r>
+        <w:t xml:space="preserve"> Agent vs CLI Agent vs </w:t>
+      </w:r>
+      <w:proofErr w:type="spellStart"/>
+      <w:r>
+        <w:t>混合模式</w:t>
+      </w:r>
+      <w:proofErr w:type="spellEnd"/>
+      <w:r>
+        <w:t>），</w:t>
+      </w:r>
+      <w:proofErr w:type="spellStart"/>
+      <w:r>
+        <w:t>使每个维度均可被迭代系统独立感知、评估与优化</w:t>
+      </w:r>
+      <w:proofErr w:type="spellEnd"/>
+      <w:r>
+        <w:t>。</w:t>
+      </w:r>
     </w:p>
     <w:p>
       <w:pPr>
@@ -622,122 +753,69 @@
       <w:r>
         <w:t xml:space="preserve">• </w:t>
       </w:r>
+      <w:r>
+        <w:t>构建</w:t>
+      </w:r>
+      <w:r>
+        <w:t xml:space="preserve"> auto-skill </w:t>
+      </w:r>
+      <w:r>
+        <w:t>生成、上传与收敛迭代</w:t>
+      </w:r>
+      <w:r>
+        <w:t xml:space="preserve"> pipeline</w:t>
+      </w:r>
+      <w:r>
+        <w:t>：基于上游挖掘的、按场景维度聚类的</w:t>
+      </w:r>
+      <w:r>
+        <w:t xml:space="preserve"> user query </w:t>
+      </w:r>
+      <w:r>
+        <w:t>与执行</w:t>
+      </w:r>
+      <w:r>
+        <w:t xml:space="preserve"> trajectory</w:t>
+      </w:r>
+      <w:r>
+        <w:t>，自动生成垂类</w:t>
+      </w:r>
+      <w:r>
+        <w:t xml:space="preserve"> Agent Skill / Playbook</w:t>
+      </w:r>
+      <w:r>
+        <w:t>，完成</w:t>
+      </w:r>
+      <w:r>
+        <w:t xml:space="preserve"> skill </w:t>
+      </w:r>
       <w:proofErr w:type="spellStart"/>
       <w:r>
-        <w:t>拆解</w:t>
+        <w:t>上传、</w:t>
+      </w:r>
+      <w:r>
+        <w:t>benchmark</w:t>
       </w:r>
       <w:proofErr w:type="spellEnd"/>
       <w:r>
-        <w:t xml:space="preserve"> Agent </w:t>
+        <w:t xml:space="preserve"> </w:t>
       </w:r>
       <w:proofErr w:type="spellStart"/>
       <w:r>
-        <w:t>效果迭代的完整可调空间并实现自动化迭代覆盖：</w:t>
-      </w:r>
-      <w:r>
-        <w:t>context</w:t>
+        <w:t>回归、失败归因与多轮迭代，直到目标场景收敛；将</w:t>
       </w:r>
       <w:proofErr w:type="spellEnd"/>
       <w:r>
-        <w:t xml:space="preserve"> </w:t>
+        <w:t xml:space="preserve"> skill </w:t>
       </w:r>
       <w:proofErr w:type="spellStart"/>
       <w:r>
-        <w:t>结构与去噪策略、</w:t>
-      </w:r>
-      <w:r>
-        <w:t>tool</w:t>
+        <w:t>从人工沉淀升级为面向垂类深度场景的自动优化单元</w:t>
       </w:r>
       <w:proofErr w:type="spellEnd"/>
       <w:r>
-        <w:t xml:space="preserve"> </w:t>
-      </w:r>
-      <w:proofErr w:type="spellStart"/>
-      <w:r>
-        <w:t>空间定义与组合、</w:t>
-      </w:r>
-      <w:r>
-        <w:t>system</w:t>
-      </w:r>
-      <w:proofErr w:type="spellEnd"/>
-      <w:r>
-        <w:t xml:space="preserve"> prompt </w:t>
-      </w:r>
-      <w:proofErr w:type="spellStart"/>
-      <w:r>
-        <w:t>工程、</w:t>
-      </w:r>
-      <w:r>
-        <w:t>Agent</w:t>
-      </w:r>
-      <w:proofErr w:type="spellEnd"/>
-      <w:r>
-        <w:t xml:space="preserve"> Skill </w:t>
-      </w:r>
-      <w:proofErr w:type="spellStart"/>
-      <w:r>
-        <w:t>注入与编排、以及方案选型（</w:t>
-      </w:r>
-      <w:r>
-        <w:t>GUI</w:t>
-      </w:r>
-      <w:proofErr w:type="spellEnd"/>
-      <w:r>
-        <w:t xml:space="preserve"> Agent vs CLI Agent vs </w:t>
-      </w:r>
-      <w:proofErr w:type="spellStart"/>
-      <w:r>
-        <w:t>混合模式</w:t>
-      </w:r>
-      <w:proofErr w:type="spellEnd"/>
-      <w:r>
-        <w:t>），</w:t>
-      </w:r>
-      <w:proofErr w:type="spellStart"/>
-      <w:r>
-        <w:t>使每个维度均可被迭代系统独立感知、评估与优化</w:t>
-      </w:r>
-      <w:proofErr w:type="spellEnd"/>
-      <w:r>
         <w:t>。</w:t>
       </w:r>
-    </w:p>
-    <w:p>
-      <w:pPr>
-        <w:pStyle w:val="Bul"/>
-      </w:pPr>
-      <w:r>
-        <w:t>• 构建 auto-skill 生成、上传与收敛迭代 pipeline：基于上游挖掘的、按场景维度聚类的 user query 与执行 trajectory，自动生成垂类 Agent Skill / Playbook，完成 skill 上传、benchmark 回归、失败归因与多轮迭代，直到目标场景收敛；将 skill 从人工沉淀升级为面向垂类深度场景的自动优化单元。</w:t>
-      </w:r>
-      <w:proofErr w:type="spellStart"/>
-      <w:r/>
-      <w:proofErr w:type="spellEnd"/>
-      <w:r/>
-      <w:proofErr w:type="spellStart"/>
-      <w:r/>
-      <w:r/>
-      <w:proofErr w:type="spellEnd"/>
-      <w:r/>
-      <w:proofErr w:type="spellStart"/>
-      <w:r/>
-      <w:proofErr w:type="spellEnd"/>
-      <w:r/>
-      <w:proofErr w:type="spellStart"/>
-      <w:r/>
-      <w:r/>
-      <w:proofErr w:type="spellEnd"/>
-      <w:r/>
-      <w:r/>
-      <w:r/>
-      <w:proofErr w:type="spellStart"/>
-      <w:r/>
-      <w:r/>
-      <w:proofErr w:type="spellEnd"/>
-      <w:r/>
-      <w:proofErr w:type="spellStart"/>
-      <w:r/>
-      <w:proofErr w:type="spellEnd"/>
-      <w:r/>
     </w:p>
     <w:p>
       <w:pPr>
@@ -1147,24 +1225,72 @@
         </w:rPr>
       </w:pPr>
       <w:r>
-        <w:t>• 负责 agentic post-training 实验与训练数据飞轮探索：基于公开 Claude 3.7-distilled BUA 数据，对 Qwen3-VL-8B-Instruct 与 UI-TARS-1.5-7B 进行轨迹 SFT / 行为微调，重点强化 tool calling、browser-use 轨迹跟随、UI grounding 与动作决策能力，并在内部 browser-use case 上获得可观察增益。</w:t>
+        <w:t xml:space="preserve">• </w:t>
+      </w:r>
+      <w:r>
+        <w:t>负责</w:t>
+      </w:r>
+      <w:r>
+        <w:t xml:space="preserve"> agentic post-training </w:t>
+      </w:r>
+      <w:r>
+        <w:t>实验与训练数据飞轮探索：基于公开</w:t>
+      </w:r>
+      <w:r>
+        <w:t xml:space="preserve"> Claude 3.7-distilled BUA </w:t>
+      </w:r>
+      <w:r>
+        <w:t>数据，对</w:t>
+      </w:r>
+      <w:r>
+        <w:t xml:space="preserve"> Qwen3-VL-8B-Instruct </w:t>
+      </w:r>
+      <w:r>
+        <w:t>与</w:t>
+      </w:r>
+      <w:r>
+        <w:t xml:space="preserve"> UI-TARS-1.5-7B </w:t>
+      </w:r>
+      <w:r>
+        <w:t>进行轨迹</w:t>
+      </w:r>
+      <w:r>
+        <w:t xml:space="preserve"> SFT / </w:t>
+      </w:r>
+      <w:r>
+        <w:t>行为微调，重点强化</w:t>
+      </w:r>
+      <w:r>
+        <w:t xml:space="preserve"> tool calling</w:t>
+      </w:r>
+      <w:r>
+        <w:t>、</w:t>
+      </w:r>
+      <w:r>
+        <w:t xml:space="preserve">browser-use </w:t>
+      </w:r>
+      <w:r>
+        <w:t>轨迹跟随、</w:t>
+      </w:r>
+      <w:r>
+        <w:t xml:space="preserve">UI grounding </w:t>
       </w:r>
       <w:proofErr w:type="spellStart"/>
-      <w:r/>
+      <w:r>
+        <w:t>与动作决策能力，并在内部</w:t>
+      </w:r>
       <w:proofErr w:type="spellEnd"/>
-      <w:r/>
+      <w:r>
+        <w:t xml:space="preserve"> browser-use case </w:t>
+      </w:r>
       <w:proofErr w:type="spellStart"/>
-      <w:r/>
+      <w:r>
+        <w:t>上获得可观察增益</w:t>
+      </w:r>
       <w:proofErr w:type="spellEnd"/>
-      <w:r/>
-      <w:proofErr w:type="spellStart"/>
-      <w:r/>
-      <w:proofErr w:type="spellEnd"/>
-      <w:r/>
-      <w:proofErr w:type="spellStart"/>
-      <w:r/>
-      <w:proofErr w:type="spellEnd"/>
-      <w:r/>
+      <w:r>
+        <w:t>。</w:t>
+      </w:r>
     </w:p>
     <w:p>
       <w:pPr>
@@ -1174,30 +1300,58 @@
         </w:rPr>
       </w:pPr>
       <w:r>
-        <w:t>• 探索基于真实专家轨迹与蒸馏轨迹的 SFT 数据飞轮，构建轻量模型在垂直任务中的替代方案，验证 7B / 8B / 30B 模型在部分高频场景下对高成本模型调用的替代潜力，以优化 token cost 与端到端时延。</w:t>
-      </w:r>
-      <w:proofErr w:type="spellStart"/>
-      <w:r/>
-      <w:proofErr w:type="spellEnd"/>
-      <w:r/>
-      <w:proofErr w:type="spellStart"/>
-      <w:r/>
-      <w:proofErr w:type="spellEnd"/>
-      <w:r/>
-      <w:proofErr w:type="spellStart"/>
-      <w:r/>
-      <w:proofErr w:type="spellEnd"/>
-      <w:r/>
-      <w:proofErr w:type="spellStart"/>
-      <w:r/>
-      <w:proofErr w:type="spellEnd"/>
-      <w:r/>
+        <w:rPr>
+          <w:lang w:eastAsia="zh-CN"/>
+        </w:rPr>
+        <w:t xml:space="preserve">• </w:t>
+      </w:r>
+      <w:r>
+        <w:rPr>
+          <w:lang w:eastAsia="zh-CN"/>
+        </w:rPr>
+        <w:t>探索基于真实专家轨迹与蒸馏轨迹的</w:t>
+      </w:r>
+      <w:r>
+        <w:rPr>
+          <w:lang w:eastAsia="zh-CN"/>
+        </w:rPr>
+        <w:t xml:space="preserve"> SFT </w:t>
+      </w:r>
+      <w:r>
+        <w:rPr>
+          <w:lang w:eastAsia="zh-CN"/>
+        </w:rPr>
+        <w:t>数据飞轮，构建轻量模型在垂直任务中的替代方案，验证</w:t>
+      </w:r>
+      <w:r>
+        <w:rPr>
+          <w:lang w:eastAsia="zh-CN"/>
+        </w:rPr>
+        <w:t xml:space="preserve"> 7B / 8B / 30B </w:t>
+      </w:r>
+      <w:r>
+        <w:rPr>
+          <w:lang w:eastAsia="zh-CN"/>
+        </w:rPr>
+        <w:t>模型在部分高频场景下对高成本模型调用的替代潜力，以优化</w:t>
+      </w:r>
+      <w:r>
+        <w:rPr>
+          <w:lang w:eastAsia="zh-CN"/>
+        </w:rPr>
+        <w:t xml:space="preserve"> token cost </w:t>
+      </w:r>
+      <w:r>
+        <w:rPr>
+          <w:lang w:eastAsia="zh-CN"/>
+        </w:rPr>
+        <w:t>与端到端时延。</w:t>
+      </w:r>
     </w:p>
     <w:p>
       <w:pPr>
         <w:pStyle w:val="Bul"/>
         <w:rPr>
-          <w:rFonts w:hint="eastAsia"/>
           <w:lang w:eastAsia="zh-CN"/>
         </w:rPr>
       </w:pPr>
@@ -1458,7 +1612,6 @@
       <w:pPr>
         <w:pStyle w:val="Bul"/>
         <w:rPr>
-          <w:rFonts w:hint="eastAsia"/>
           <w:lang w:eastAsia="zh-CN"/>
         </w:rPr>
       </w:pPr>
@@ -1894,6 +2047,9 @@
     <w:p>
       <w:pPr>
         <w:pStyle w:val="Role"/>
+        <w:rPr>
+          <w:lang w:eastAsia="zh-CN"/>
+        </w:rPr>
       </w:pPr>
     </w:p>
     <w:p>
@@ -2208,33 +2364,7 @@
         </w:rPr>
         <w:t xml:space="preserve">LLM / Agent: </w:t>
       </w:r>
-      <w:r/>
-      <w:proofErr w:type="spellStart"/>
-      <w:r/>
-      <w:proofErr w:type="spellEnd"/>
-      <w:r/>
-      <w:proofErr w:type="spellStart"/>
-      <w:r/>
-      <w:proofErr w:type="spellEnd"/>
-      <w:r/>
-      <w:proofErr w:type="spellStart"/>
-      <w:r/>
-      <w:proofErr w:type="spellEnd"/>
-      <w:r/>
-      <w:r>
-        <w:rPr>
-          <w:b w:val="0"/>
-        </w:rPr>
-      </w:r>
-      <w:r>
-        <w:rPr>
-          <w:b w:val="0"/>
-        </w:rPr>
-      </w:r>
-      <w:r>
-        <w:rPr>
-          <w:b w:val="0"/>
-        </w:rPr>
+      <w:r>
         <w:t>Agent harness self-iteration pipeline, auto-evaluation / auto-analysis / auto-iteration, auto-skill generation / upload / convergence loop, scenario clustering over user queries and trajectories, agentic post-training, tool calling SFT, BUA trajectory data, Qwen3-VL-8B-Instruct, UI-TARS-1.5-7B, control-theoretic agent loop design (plant / controller / observer / feedback), training-style iteration (benchmark→loss→gradient over context / memory / skill / system prompt), browser-use / computer-use agents, ReAct, context engineering, tool orchestration, system prompt engineering, skill injection &amp; design, LangGraph, RAG, prompt engineering</w:t>
       </w:r>
     </w:p>
@@ -2248,16 +2378,7 @@
         </w:rPr>
         <w:t xml:space="preserve">Training / Modeling: </w:t>
       </w:r>
-      <w:r/>
-      <w:r>
-        <w:rPr>
-          <w:b w:val="0"/>
-        </w:rPr>
-      </w:r>
-      <w:r>
-        <w:rPr>
-          <w:b w:val="0"/>
-        </w:rPr>
+      <w:r>
         <w:t>SFT, agent trajectory construction, VLM / GUI agent post-training, Transformers, GRU, CNN, model compression, offline evaluation, approximation optimization</w:t>
       </w:r>
     </w:p>

</xml_diff>